<commit_message>
Tighten Smoke Test Brief tone and content per Tim's feedback
</commit_message>
<xml_diff>
--- a/lab-manual/John Smoke Test Brief.docx
+++ b/lab-manual/John Smoke Test Brief.docx
@@ -38,12 +38,12 @@
           <w:color w:val="1F4E79"/>
           <w:sz w:val="28"/>
         </w:rPr>
-        <w:t>Thanks</w:t>
+        <w:t>Thank You</w:t>
       </w:r>
     </w:p>
     <w:p>
       <w:r>
-        <w:t>John, this is huge. You're helping us ship what we believe will be one of the first custom Salesforce workshops of its kind, and your run is the one chance we have to catch participant-level issues before 20 MTA folks hit the same wall at 10:15 AM Monday. Grateful.</w:t>
+        <w:t>John, thanks for offering to walk through the material. This may be one of the first fully-custom Salesforce workshops of its kind, and your run gives us a chance to catch participant-level issues before 20 MTA folks hit them on Day 1.</w:t>
       </w:r>
     </w:p>
     <w:p>
@@ -133,7 +133,7 @@
     </w:p>
     <w:p>
       <w:r>
-        <w:t>~8.5 hours authored. Realistic pace with notes: 10-12 hours. Wed and Thu is enough if you can block the time; Lab 7 can slide to Thursday evening if needed.</w:t>
+        <w:t>Work through what you can at the pace that fits your schedule.</w:t>
       </w:r>
     </w:p>
     <w:p>
@@ -151,69 +151,7 @@
     </w:p>
     <w:p>
       <w:r>
-        <w:t>Pre-deployed before you start:</w:t>
-      </w:r>
-    </w:p>
-    <w:p>
-      <w:pPr>
-        <w:pStyle w:val="ListBullet"/>
-        <w:spacing w:after="40"/>
-      </w:pPr>
-      <w:r>
-        <w:t>v09-org-prep: time zone set to America/New_York, AgentActionsTest.cls patched, permset state confirmed (your Pronto admin user already has Agentforce and Prompt Template permsets by default)</w:t>
-      </w:r>
-    </w:p>
-    <w:p>
-      <w:r>
-        <w:t>Not pre-deployed (you build these during the labs, exactly like participants will):</w:t>
-      </w:r>
-    </w:p>
-    <w:p>
-      <w:pPr>
-        <w:pStyle w:val="ListBullet"/>
-        <w:spacing w:after="40"/>
-      </w:pPr>
-      <w:r>
-        <w:t>Case customizations — you build these in Lab 1 from scratch</w:t>
-      </w:r>
-    </w:p>
-    <w:p>
-      <w:pPr>
-        <w:pStyle w:val="ListBullet"/>
-        <w:spacing w:after="40"/>
-      </w:pPr>
-      <w:r>
-        <w:t>Service_Disruption__c — you build this in Lab 5</w:t>
-      </w:r>
-    </w:p>
-    <w:p>
-      <w:pPr>
-        <w:pStyle w:val="ListBullet"/>
-        <w:spacing w:after="40"/>
-      </w:pPr>
-      <w:r>
-        <w:t>Lab 7's Agentforce agent — you build this in Lab 7</w:t>
-      </w:r>
-    </w:p>
-    <w:p>
-      <w:pPr>
-        <w:spacing w:before="80" w:after="80"/>
-        <w:ind w:left="227"/>
-      </w:pPr>
-      <w:r>
-        <w:rPr>
-          <w:b/>
-          <w:color w:val="2E75B6"/>
-        </w:rPr>
-        <w:t xml:space="preserve">End-of-Day-1 catchup: </w:t>
-      </w:r>
-      <w:r>
-        <w:t>Our v09.5-day1-catchup package exists as a safety net: if a participant stalls partway through, we deploy the end-of-Day-1 metadata (v07 Case extensions + Service_Disruption__c + layouts) to their org that evening so they can start Day 2 clean. You should NOT need this during the smoke test; you'll build everything yourself. If you want to see what we'd give stragglers, ask and I'll walk you through it.</w:t>
-      </w:r>
-    </w:p>
-    <w:p>
-      <w:r>
-        <w:t>v08-sla-extension (SLA formula fields on Service_Disruption__c) deploys after you finish Lab 5.</w:t>
+        <w:t>Pre-deployed before you start: v09-org-prep (time zone set to America/New_York, AgentActionsTest.cls patched, permset state confirmed; the Pronto admin user already has Agentforce and Prompt Template permsets by default). You build everything else during the labs exactly as participants will.</w:t>
       </w:r>
     </w:p>
     <w:p>
@@ -253,7 +191,7 @@
         <w:spacing w:after="40"/>
       </w:pPr>
       <w:r>
-        <w:t>The chain: each lab's output feeds the next. Golden Case from Lab 1 threads through Labs 2-5 and gets a Service Disruption lookup. SD from Lab 5 drives Lab 6's Flow, Prompt Builder, Approval, Reports. Lab 6 artifacts get wrapped by Lab 7's agent. If a link breaks, downstream labs fail for reasons that look wrong (the Flow does not fire) but are actually upstream (the Case was not linked in Lab 3).</w:t>
+        <w:t>The chain: each lab's output feeds the next. Golden Case from Lab 1 threads through Labs 2-5 and gets a Service Disruption lookup. Service Disruption from Lab 5 drives Lab 6's Flow, Prompt Builder, Approval, Reports. Lab 6 artifacts get wrapped by Lab 7's agent. If a link breaks, downstream labs can fail for reasons that look wrong (the Flow does not fire) but are actually upstream (the Case was not linked in Lab 3).</w:t>
       </w:r>
     </w:p>
     <w:p>
@@ -347,7 +285,7 @@
         <w:spacing w:after="40"/>
       </w:pPr>
       <w:r>
-        <w:t>Hard block (lab breaks, agent won't fire): Slack DM Tim. Expect a fix inside an hour during business hours Wed-Thu</w:t>
+        <w:t>Hard block (lab breaks, agent won't fire): send Tim a note so we can look at it</w:t>
       </w:r>
     </w:p>
     <w:p>
@@ -437,43 +375,12 @@
           <w:color w:val="1F4E79"/>
           <w:sz w:val="28"/>
         </w:rPr>
-        <w:t>Resources</w:t>
-      </w:r>
-    </w:p>
-    <w:p>
-      <w:pPr>
-        <w:pStyle w:val="ListBullet"/>
-        <w:spacing w:after="40"/>
-      </w:pPr>
-      <w:r>
-        <w:t>Workshop site (agenda, lab previews, downloads): the GitHub Pages URL Tim will send you</w:t>
-      </w:r>
-    </w:p>
-    <w:p>
-      <w:pPr>
-        <w:pStyle w:val="ListBullet"/>
-        <w:spacing w:after="40"/>
-      </w:pPr>
-      <w:r>
-        <w:t>Executive Scenario Simulation (Day 2 closing, not in your smoke test): lab-manual/Executive Scenario Simulation.docx. Read if curious; no need to run.</w:t>
-      </w:r>
-    </w:p>
-    <w:p>
-      <w:pPr>
-        <w:spacing w:before="280" w:after="80"/>
-      </w:pPr>
-      <w:r>
-        <w:rPr>
-          <w:b/>
-          <w:color w:val="1F4E79"/>
-          <w:sz w:val="28"/>
-        </w:rPr>
-        <w:t>One more time</w:t>
+        <w:t>Wrap</w:t>
       </w:r>
     </w:p>
     <w:p>
       <w:r>
-        <w:t>Thank you. The MTA will walk out of Day 2 with something real because you helped us smooth the rough edges first. If this becomes the first great custom Salesforce workshop, that is partly because of you.</w:t>
+        <w:t>We really appreciate having you walk through what you can. Thank you!</w:t>
       </w:r>
     </w:p>
     <w:sectPr>

</xml_diff>